<commit_message>
Plural y agregar a Susana
</commit_message>
<xml_diff>
--- a/Informe EDA Airbnb NYC.docx
+++ b/Informe EDA Airbnb NYC.docx
@@ -52,24 +52,8 @@
     </w:p>
     <w:p>
       <w:pPr>
-        <w:keepNext/>
-        <w:spacing w:after="160" w:before="240"/>
-      </w:pPr>
-      <w:r>
-        <w:rPr>
-          <w:rFonts w:ascii="Arial" w:cs="Arial" w:eastAsia="Arial" w:hAnsi="Arial"/>
-          <w:b/>
-          <w:bCs/>
-          <w:sz w:val="24"/>
-          <w:szCs w:val="24"/>
-        </w:rPr>
-        <w:t xml:space="preserve">1. Objetivo y forma de trabajo</w:t>
-      </w:r>
-    </w:p>
-    <w:p>
-      <w:pPr>
-        <w:spacing w:after="160" w:line="300"/>
-        <w:jc w:val="both"/>
+        <w:spacing w:after="160" w:line="300"/>
+        <w:jc w:val="center"/>
       </w:pPr>
       <w:r>
         <w:rPr>
@@ -79,7 +63,23 @@
           <w:sz w:val="24"/>
           <w:szCs w:val="24"/>
         </w:rPr>
-        <w:t xml:space="preserve">El objetivo fue explorar visualmente el conjunto de alquileres de Airbnb de Nueva York que viene en el libro de Tableau del starter, mirando los datos desde varios puntos de vista y usando interacción para entender cómo se relacionan los gráficos entre sí. Todo se construyó en Tableau Desktop sobre la misma fuente de datos del starter (Airbnb_listing), y el resultado final quedó empaquetado en el archivo EDA Airbnb NYC.twbx.</w:t>
+        <w:t xml:space="preserve">Susana Toro</w:t>
+      </w:r>
+    </w:p>
+    <w:p>
+      <w:pPr>
+        <w:keepNext/>
+        <w:spacing w:after="160" w:before="240"/>
+      </w:pPr>
+      <w:r>
+        <w:rPr>
+          <w:rFonts w:ascii="Arial" w:cs="Arial" w:eastAsia="Arial" w:hAnsi="Arial"/>
+          <w:b/>
+          <w:bCs/>
+          <w:sz w:val="24"/>
+          <w:szCs w:val="24"/>
+        </w:rPr>
+        <w:t xml:space="preserve">1. Objetivo y forma de trabajo</w:t>
       </w:r>
     </w:p>
     <w:p>
@@ -95,23 +95,7 @@
           <w:sz w:val="24"/>
           <w:szCs w:val="24"/>
         </w:rPr>
-        <w:t xml:space="preserve">No seguí un orden fijo. Empecé por saber cuánto hay y dónde está, después pasé al precio, luego a los anfitriones y por último a la actividad (reseñas). Cada gráfico fue dejando una pregunta nueva, y algunas de esas preguntas me obligaron a cambiar el gráfico anterior, por ejemplo filtrar, recortar el eje o cambiar la variable de color. Al final junté las vistas más útiles en dos dashboards con acciones de filtro y resaltado.</w:t>
-      </w:r>
-    </w:p>
-    <w:p>
-      <w:pPr>
-        <w:keepNext/>
-        <w:spacing w:after="160" w:before="240"/>
-      </w:pPr>
-      <w:r>
-        <w:rPr>
-          <w:rFonts w:ascii="Arial" w:cs="Arial" w:eastAsia="Arial" w:hAnsi="Arial"/>
-          <w:b/>
-          <w:bCs/>
-          <w:sz w:val="24"/>
-          <w:szCs w:val="24"/>
-        </w:rPr>
-        <w:t xml:space="preserve">2. Preparación de los datos</w:t>
+        <w:t xml:space="preserve">El objetivo fue explorar visualmente el conjunto de alquileres de Airbnb de Nueva York que viene en el libro de Tableau del starter, mirando los datos desde varios puntos de vista y usando interacción para entender cómo se relacionan los gráficos entre sí. Todo se construyó en Tableau Desktop sobre la misma fuente de datos del starter (Airbnb_listing), y el resultado final quedó empaquetado en el archivo EDA Airbnb NYC.twbx.</w:t>
       </w:r>
     </w:p>
     <w:p>
@@ -127,7 +111,39 @@
           <w:sz w:val="24"/>
           <w:szCs w:val="24"/>
         </w:rPr>
-        <w:t xml:space="preserve">Antes de graficar renombré los campos al español (Distrito, Barrio, Tipo de habitación, Precio, etc.) para que los ejes se leyeran solos, y creé algunos campos calculados que fui necesitando en el camino:</w:t>
+        <w:t xml:space="preserve">No seguimos un orden fijo. Empezamos por saber cuánto hay y dónde está, después pasamos al precio, luego a los anfitriones y por último a la actividad (reseñas). Cada gráfico fue dejando una pregunta nueva, y algunas de esas preguntas nos obligaron a cambiar el gráfico anterior, por ejemplo filtrar, recortar el eje o cambiar la variable de color. Al final juntamos las vistas más útiles en dos dashboards con acciones de filtro y resaltado.</w:t>
+      </w:r>
+    </w:p>
+    <w:p>
+      <w:pPr>
+        <w:keepNext/>
+        <w:spacing w:after="160" w:before="240"/>
+      </w:pPr>
+      <w:r>
+        <w:rPr>
+          <w:rFonts w:ascii="Arial" w:cs="Arial" w:eastAsia="Arial" w:hAnsi="Arial"/>
+          <w:b/>
+          <w:bCs/>
+          <w:sz w:val="24"/>
+          <w:szCs w:val="24"/>
+        </w:rPr>
+        <w:t xml:space="preserve">2. Preparación de los datos</w:t>
+      </w:r>
+    </w:p>
+    <w:p>
+      <w:pPr>
+        <w:spacing w:after="160" w:line="300"/>
+        <w:jc w:val="both"/>
+      </w:pPr>
+      <w:r>
+        <w:rPr>
+          <w:rFonts w:ascii="Arial" w:cs="Arial" w:eastAsia="Arial" w:hAnsi="Arial"/>
+          <w:b w:val="false"/>
+          <w:bCs w:val="false"/>
+          <w:sz w:val="24"/>
+          <w:szCs w:val="24"/>
+        </w:rPr>
+        <w:t xml:space="preserve">Antes de graficar renombramos los campos al español (Distrito, Barrio, Tipo de habitación, Precio, etc.) para que los ejes se leyeran solos, y creamos algunos campos calculados que fuimos necesitando en el camino:</w:t>
       </w:r>
     </w:p>
     <w:p>
@@ -175,7 +191,7 @@
           <w:sz w:val="24"/>
           <w:szCs w:val="24"/>
         </w:rPr>
-        <w:t xml:space="preserve">MEDIAN(IF [price] &gt; 0 THEN [price] END). Usé la mediana y no el promedio porque el precio tiene valores extremos (hay un alquiler de 19.750 USD la noche) y porque hay 30 habitaciones de hotel con precio 0 que no son precios reales.</w:t>
+        <w:t xml:space="preserve">MEDIAN(IF [price] &gt; 0 THEN [price] END). Usamos la mediana y no el promedio porque el precio tiene valores extremos (hay un alquiler de 19.750 USD la noche) y porque hay 30 habitaciones de hotel con precio 0 que no son precios reales.</w:t>
       </w:r>
     </w:p>
     <w:p>
@@ -223,7 +239,7 @@
           <w:sz w:val="24"/>
           <w:szCs w:val="24"/>
         </w:rPr>
-        <w:t xml:space="preserve">{FIXED [host_id] : COUNT([id])}, el número de alquileres que publica cada anfitrión. A partir de él armé Tamaño del portafolio (1, 2 a 4, 5 a 19, 20 o más).</w:t>
+        <w:t xml:space="preserve">{FIXED [host_id] : COUNT([id])}, el número de alquileres que publica cada anfitrión. A partir de él armamos Tamaño del portafolio (1, 2 a 4, 5 a 19, 20 o más).</w:t>
       </w:r>
     </w:p>
     <w:p>
@@ -247,7 +263,7 @@
           <w:sz w:val="24"/>
           <w:szCs w:val="24"/>
         </w:rPr>
-        <w:t xml:space="preserve">{FIXED [neighbourhood] : COUNT([id])}, para quedarme solo con barrios que tienen suficientes alquileres.</w:t>
+        <w:t xml:space="preserve">{FIXED [neighbourhood] : COUNT([id])}, para quedarnos solo con barrios que tienen suficientes alquileres.</w:t>
       </w:r>
     </w:p>
     <w:p>
@@ -473,7 +489,7 @@
           <w:sz w:val="24"/>
           <w:szCs w:val="24"/>
         </w:rPr>
-        <w:t xml:space="preserve">Manhattan (17.334) y Brooklyn (15.688) concentran casi el 80% de la oferta. Staten Island casi no aparece. El color muestra algo que no esperaba: la mezcla de tipos cambia según el distrito. En Manhattan el 63% son casas o apartamentos enteros, mientras que en Queens y el Bronx las habitaciones privadas ya son más de la mitad. Las habitaciones compartidas y de hotel son casi invisibles en toda la ciudad.</w:t>
+        <w:t xml:space="preserve">Manhattan (17.334) y Brooklyn (15.688) concentran casi el 80% de la oferta. Staten Island casi no aparece. El color muestra algo que no esperábamos: la mezcla de tipos cambia según el distrito. En Manhattan el 63% son casas o apartamentos enteros, mientras que en Queens y el Bronx las habitaciones privadas ya son más de la mitad. Las habitaciones compartidas y de hotel son casi invisibles en toda la ciudad.</w:t>
       </w:r>
     </w:p>
     <w:p>
@@ -550,7 +566,7 @@
           <w:sz w:val="24"/>
           <w:szCs w:val="24"/>
         </w:rPr>
-        <w:t xml:space="preserve">El mapa confirma la concentración, pero con más detalle. Los puntos se amontonan en el sur y centro de Manhattan y en el norte de Brooklyn (Williamsburg, Bedford-Stuyvesant, Bushwick). Los tonos más oscuros, que son los más caros, quedan en Midtown y en la parte baja de Manhattan. Puse un tope de 500 USD en el color porque sin él los pocos alquileres de miles de dólares dejaban todo el mapa del mismo color claro.</w:t>
+        <w:t xml:space="preserve">El mapa confirma la concentración, pero con más detalle. Los puntos se amontonan en el sur y centro de Manhattan y en el norte de Brooklyn (Williamsburg, Bedford-Stuyvesant, Bushwick). Los tonos más oscuros, que son los más caros, quedan en Midtown y en la parte baja de Manhattan. Pusimos un tope de 500 USD en el color porque sin él los pocos alquileres de miles de dólares dejaban todo el mapa del mismo color claro.</w:t>
       </w:r>
     </w:p>
     <w:p>
@@ -643,7 +659,7 @@
           <w:sz w:val="24"/>
           <w:szCs w:val="24"/>
         </w:rPr>
-        <w:t xml:space="preserve">La distribución está muy cargada a la izquierda y tiene una cola larga a la derecha. La mediana general es 131 USD y el 72% de los alquileres cuesta 200 USD o menos. Al colorear por tipo aparecen casi dos distribuciones encimadas: las habitaciones privadas se agrupan entre 25 y 100 USD y las casas enteras empiezan a pesar desde 100 USD hacia arriba. Dejé fuera del gráfico los 776 alquileres de más de 1.000 USD para poder ver la forma.</w:t>
+        <w:t xml:space="preserve">La distribución está muy cargada a la izquierda y tiene una cola larga a la derecha. La mediana general es 131 USD y el 72% de los alquileres cuesta 200 USD o menos. Al colorear por tipo aparecen casi dos distribuciones encimadas: las habitaciones privadas se agrupan entre 25 y 100 USD y las casas enteras empiezan a pesar desde 100 USD hacia arriba. Dejamos fuera del gráfico los 776 alquileres de más de 1.000 USD para poder ver la forma.</w:t>
       </w:r>
     </w:p>
     <w:p>
@@ -797,7 +813,7 @@
           <w:sz w:val="24"/>
           <w:szCs w:val="24"/>
         </w:rPr>
-        <w:t xml:space="preserve">Primero hice este gráfico con todos los tipos de habitación y salía muy ruidoso, porque hay muy pocas habitaciones compartidas o privadas para 7 u 8 personas y una sola publicación movía la mediana a 1.800 USD. Me quedé con las casas enteras de 1 a 10 personas y ahí la relación es clara: el precio sube casi todo el tiempo con la capacidad, de 125 USD para una persona a 450 USD para diez.</w:t>
+        <w:t xml:space="preserve">Primero hicimos este gráfico con todos los tipos de habitación y salía muy ruidoso, porque hay muy pocas habitaciones compartidas o privadas para 7 u 8 personas y una sola publicación movía la mediana a 1.800 USD. Nos quedamos con las casas enteras de 1 a 10 personas y ahí la relación es clara: el precio sube casi todo el tiempo con la capacidad, de 125 USD para una persona a 450 USD para diez.</w:t>
       </w:r>
     </w:p>
     <w:p>
@@ -874,7 +890,7 @@
           <w:sz w:val="24"/>
           <w:szCs w:val="24"/>
         </w:rPr>
-        <w:t xml:space="preserve">Aquí bajé del distrito al barrio. Filtré los barrios con menos de 300 alquileres para que la mediana fuera estable. Theater District (421 USD), Financial District (325) y Midtown (285) encabezan la lista, todos en Manhattan. Al final quedan Woodside (45 USD) y Flushing (75), en Queens. Brooklyn queda repartido en la mitad, con Park Slope como el más caro de ese distrito.</w:t>
+        <w:t xml:space="preserve">Aquí bajamos del distrito al barrio. Filtramos los barrios con menos de 300 alquileres para que la mediana fuera estable. Theater District (421 USD), Financial District (325) y Midtown (285) encabezan la lista, todos en Manhattan. Al final quedan Woodside (45 USD) y Flushing (75), en Queens. Brooklyn queda repartido en la mitad, con Park Slope como el más caro de ese distrito.</w:t>
       </w:r>
     </w:p>
     <w:p>
@@ -1044,7 +1060,7 @@
           <w:sz w:val="24"/>
           <w:szCs w:val="24"/>
         </w:rPr>
-        <w:t xml:space="preserve">Al ver los nombres se nota que muchos de estos anfitriones son empresas: Blueground (487 alquileres, todos apartamentos enteros), RoomPicks, Urban Furnished o Stay With Vibe. Otro grupo se dedica casi solo a habitaciones privadas. En la primera versión de este gráfico agrupé por nombre y desaparecían anfitriones como Eugene (345) porque había otras personas llamadas igual con un solo alquiler; por eso terminé agrupando por el id del anfitrión.</w:t>
+        <w:t xml:space="preserve">Al ver los nombres se nota que muchos de estos anfitriones son empresas: Blueground (487 alquileres, todos apartamentos enteros), RoomPicks, Urban Furnished o Stay With Vibe. Otro grupo se dedica casi solo a habitaciones privadas. En la primera versión de este gráfico agrupamos por nombre y desaparecían anfitriones como Eugene (345) porque había otras personas llamadas igual con un solo alquiler; por eso terminamos agrupando por el id del anfitrión.</w:t>
       </w:r>
     </w:p>
     <w:p>
@@ -1291,7 +1307,7 @@
           <w:sz w:val="24"/>
           <w:szCs w:val="24"/>
         </w:rPr>
-        <w:t xml:space="preserve">Quería saber si los alquileres más baratos se rentan más. El gráfico dice que no hay una relación clara: la nube está pegada a los ejes y la correlación de Spearman entre precio y número de reseñas es prácticamente cero (0,03). Lo que sí se ve es que los alquileres con cientos de reseñas casi siempre cuestan menos de 300 USD.</w:t>
+        <w:t xml:space="preserve">Queríamos saber si los alquileres más baratos se rentan más. El gráfico dice que no hay una relación clara: la nube está pegada a los ejes y la correlación de Spearman entre precio y número de reseñas es prácticamente cero (0,03). Lo que sí se ve es que los alquileres con cientos de reseñas casi siempre cuestan menos de 300 USD.</w:t>
       </w:r>
     </w:p>
     <w:p>
@@ -1400,7 +1416,7 @@
           <w:sz w:val="24"/>
           <w:szCs w:val="24"/>
         </w:rPr>
-        <w:t xml:space="preserve">Con las hojas anteriores armé dos dashboards. En los dos, un gráfico funciona como control de los demás mediante acciones de filtro, y en el primero también hay una acción de resaltado y un filtro rápido por tipo de habitación que afecta al mapa, al histograma y al gráfico de distritos.</w:t>
+        <w:t xml:space="preserve">Con las hojas anteriores armamos dos dashboards. En los dos, un gráfico funciona como control de los demás mediante acciones de filtro, y en el primero también hay una acción de resaltado y un filtro rápido por tipo de habitación que afecta al mapa, al histograma y al gráfico de distritos.</w:t>
       </w:r>
     </w:p>
     <w:p>
@@ -1708,7 +1724,7 @@
           <w:sz w:val="24"/>
           <w:szCs w:val="24"/>
         </w:rPr>
-        <w:t xml:space="preserve">Esta interacción fue la que más me sorprendió. Al filtrar por los anfitriones con 20 o más alquileres, la barra de alquileres sin reseñas pasa a ser la más alta: 2.347 de sus 4.912 alquileres (48%) nunca han tenido una reseña, contra el 21% de los anfitriones con un solo alquiler. La línea de creación de cuentas también cambia de forma y deja de tener el pico de 2015. Parece que los anfitriones grandes publican mucho inventario que casi no se alquila, o que se alquila por fuera de la plataforma.</w:t>
+        <w:t xml:space="preserve">Esta interacción fue la que más nos sorprendió. Al filtrar por los anfitriones con 20 o más alquileres, la barra de alquileres sin reseñas pasa a ser la más alta: 2.347 de sus 4.912 alquileres (48%) nunca han tenido una reseña, contra el 21% de los anfitriones con un solo alquiler. La línea de creación de cuentas también cambia de forma y deja de tener el pico de 2015. Parece que los anfitriones grandes publican mucho inventario que casi no se alquila, o que se alquila por fuera de la plataforma.</w:t>
       </w:r>
     </w:p>
     <w:p>
@@ -1724,7 +1740,7 @@
           <w:sz w:val="24"/>
           <w:szCs w:val="24"/>
         </w:rPr>
-        <w:t xml:space="preserve">5. Lo que aprendí de los alquileres de Airbnb en Nueva York</w:t>
+        <w:t xml:space="preserve">5. Lo que aprendimos de los alquileres de Airbnb en Nueva York</w:t>
       </w:r>
     </w:p>
     <w:p>

</xml_diff>